<commit_message>
done p1 + bai1p2
</commit_message>
<xml_diff>
--- a/Tuan05/LeVietHoang_22679731_Tuan05.docx
+++ b/Tuan05/LeVietHoang_22679731_Tuan05.docx
@@ -4,10 +4,1547 @@
   <w:body>
     <w:p>
       <w:pPr>
+        <w:pStyle w:val="Heading1"/>
+        <w:ind w:firstLine="0"/>
+      </w:pPr>
+      <w:r>
+        <w:t xml:space="preserve">Phần 1: </w:t>
+      </w:r>
+      <w:r>
+        <w:t>Một số lệnh Docker Compose cơ bản:</w:t>
+      </w:r>
+    </w:p>
+    <w:p>
+      <w:pPr>
+        <w:pStyle w:val="Heading2"/>
+        <w:ind w:firstLine="0"/>
+        <w:rPr>
+          <w:rFonts w:ascii="Times New Roman" w:hAnsi="Times New Roman" w:cs="Times New Roman"/>
+          <w:b/>
+          <w:color w:val="auto"/>
+          <w:sz w:val="26"/>
+          <w:szCs w:val="26"/>
+        </w:rPr>
+      </w:pPr>
+      <w:r>
+        <w:rPr>
+          <w:rFonts w:ascii="Times New Roman" w:hAnsi="Times New Roman" w:cs="Times New Roman"/>
+          <w:b/>
+          <w:color w:val="auto"/>
+          <w:sz w:val="26"/>
+          <w:szCs w:val="26"/>
+        </w:rPr>
+        <w:t>1.</w:t>
+      </w:r>
+    </w:p>
+    <w:p>
+      <w:pPr>
+        <w:ind w:firstLine="0"/>
+      </w:pPr>
+      <w:r>
+        <w:drawing>
+          <wp:inline distT="0" distB="0" distL="0" distR="0" wp14:anchorId="2F00FD61" wp14:editId="540544A9">
+            <wp:extent cx="5372850" cy="438211"/>
+            <wp:effectExtent l="0" t="0" r="0" b="0"/>
+            <wp:docPr id="18" name="Picture 18"/>
+            <wp:cNvGraphicFramePr>
+              <a:graphicFrameLocks xmlns:a="http://schemas.openxmlformats.org/drawingml/2006/main" noChangeAspect="1"/>
+            </wp:cNvGraphicFramePr>
+            <a:graphic xmlns:a="http://schemas.openxmlformats.org/drawingml/2006/main">
+              <a:graphicData uri="http://schemas.openxmlformats.org/drawingml/2006/picture">
+                <pic:pic xmlns:pic="http://schemas.openxmlformats.org/drawingml/2006/picture">
+                  <pic:nvPicPr>
+                    <pic:cNvPr id="1" name=""/>
+                    <pic:cNvPicPr/>
+                  </pic:nvPicPr>
+                  <pic:blipFill>
+                    <a:blip r:embed="rId6"/>
+                    <a:stretch>
+                      <a:fillRect/>
+                    </a:stretch>
+                  </pic:blipFill>
+                  <pic:spPr>
+                    <a:xfrm>
+                      <a:off x="0" y="0"/>
+                      <a:ext cx="5372850" cy="438211"/>
+                    </a:xfrm>
+                    <a:prstGeom prst="rect">
+                      <a:avLst/>
+                    </a:prstGeom>
+                  </pic:spPr>
+                </pic:pic>
+              </a:graphicData>
+            </a:graphic>
+          </wp:inline>
+        </w:drawing>
+      </w:r>
+    </w:p>
+    <w:p>
+      <w:pPr>
+        <w:pStyle w:val="Heading2"/>
+        <w:ind w:firstLine="0"/>
+        <w:rPr>
+          <w:rFonts w:ascii="Times New Roman" w:hAnsi="Times New Roman" w:cs="Times New Roman"/>
+          <w:b/>
+          <w:color w:val="auto"/>
+          <w:sz w:val="26"/>
+          <w:szCs w:val="26"/>
+        </w:rPr>
+      </w:pPr>
+      <w:r>
+        <w:rPr>
+          <w:rFonts w:ascii="Times New Roman" w:hAnsi="Times New Roman" w:cs="Times New Roman"/>
+          <w:b/>
+          <w:color w:val="auto"/>
+          <w:sz w:val="26"/>
+          <w:szCs w:val="26"/>
+        </w:rPr>
+        <w:t>2</w:t>
+      </w:r>
+      <w:r>
+        <w:rPr>
+          <w:rFonts w:ascii="Times New Roman" w:hAnsi="Times New Roman" w:cs="Times New Roman"/>
+          <w:b/>
+          <w:color w:val="auto"/>
+          <w:sz w:val="26"/>
+          <w:szCs w:val="26"/>
+        </w:rPr>
+        <w:t>.</w:t>
+      </w:r>
+    </w:p>
+    <w:p>
+      <w:pPr>
+        <w:ind w:firstLine="0"/>
+      </w:pPr>
+      <w:r>
+        <w:drawing>
+          <wp:inline distT="0" distB="0" distL="0" distR="0" wp14:anchorId="290B0F6F" wp14:editId="3786E31C">
+            <wp:extent cx="6115050" cy="2114550"/>
+            <wp:effectExtent l="0" t="0" r="0" b="0"/>
+            <wp:docPr id="19" name="Picture 19"/>
+            <wp:cNvGraphicFramePr>
+              <a:graphicFrameLocks xmlns:a="http://schemas.openxmlformats.org/drawingml/2006/main" noChangeAspect="1"/>
+            </wp:cNvGraphicFramePr>
+            <a:graphic xmlns:a="http://schemas.openxmlformats.org/drawingml/2006/main">
+              <a:graphicData uri="http://schemas.openxmlformats.org/drawingml/2006/picture">
+                <pic:pic xmlns:pic="http://schemas.openxmlformats.org/drawingml/2006/picture">
+                  <pic:nvPicPr>
+                    <pic:cNvPr id="1" name=""/>
+                    <pic:cNvPicPr/>
+                  </pic:nvPicPr>
+                  <pic:blipFill>
+                    <a:blip r:embed="rId7"/>
+                    <a:stretch>
+                      <a:fillRect/>
+                    </a:stretch>
+                  </pic:blipFill>
+                  <pic:spPr>
+                    <a:xfrm>
+                      <a:off x="0" y="0"/>
+                      <a:ext cx="6115050" cy="2114550"/>
+                    </a:xfrm>
+                    <a:prstGeom prst="rect">
+                      <a:avLst/>
+                    </a:prstGeom>
+                  </pic:spPr>
+                </pic:pic>
+              </a:graphicData>
+            </a:graphic>
+          </wp:inline>
+        </w:drawing>
+      </w:r>
+    </w:p>
+    <w:p>
+      <w:pPr>
+        <w:pStyle w:val="Heading2"/>
+        <w:ind w:firstLine="0"/>
+        <w:rPr>
+          <w:rFonts w:ascii="Times New Roman" w:hAnsi="Times New Roman" w:cs="Times New Roman"/>
+          <w:b/>
+          <w:color w:val="auto"/>
+          <w:sz w:val="26"/>
+          <w:szCs w:val="26"/>
+        </w:rPr>
+      </w:pPr>
+      <w:r>
+        <w:rPr>
+          <w:rFonts w:ascii="Times New Roman" w:hAnsi="Times New Roman" w:cs="Times New Roman"/>
+          <w:b/>
+          <w:color w:val="auto"/>
+          <w:sz w:val="26"/>
+          <w:szCs w:val="26"/>
+        </w:rPr>
+        <w:t>3</w:t>
+      </w:r>
+      <w:r>
+        <w:rPr>
+          <w:rFonts w:ascii="Times New Roman" w:hAnsi="Times New Roman" w:cs="Times New Roman"/>
+          <w:b/>
+          <w:color w:val="auto"/>
+          <w:sz w:val="26"/>
+          <w:szCs w:val="26"/>
+        </w:rPr>
+        <w:t>.</w:t>
+      </w:r>
+    </w:p>
+    <w:p>
+      <w:pPr>
+        <w:ind w:firstLine="0"/>
+      </w:pPr>
+      <w:r>
+        <w:drawing>
+          <wp:inline distT="0" distB="0" distL="0" distR="0" wp14:anchorId="0AE89D00" wp14:editId="29732C2E">
+            <wp:extent cx="6115050" cy="603885"/>
+            <wp:effectExtent l="0" t="0" r="0" b="5715"/>
+            <wp:docPr id="20" name="Picture 20"/>
+            <wp:cNvGraphicFramePr>
+              <a:graphicFrameLocks xmlns:a="http://schemas.openxmlformats.org/drawingml/2006/main" noChangeAspect="1"/>
+            </wp:cNvGraphicFramePr>
+            <a:graphic xmlns:a="http://schemas.openxmlformats.org/drawingml/2006/main">
+              <a:graphicData uri="http://schemas.openxmlformats.org/drawingml/2006/picture">
+                <pic:pic xmlns:pic="http://schemas.openxmlformats.org/drawingml/2006/picture">
+                  <pic:nvPicPr>
+                    <pic:cNvPr id="1" name=""/>
+                    <pic:cNvPicPr/>
+                  </pic:nvPicPr>
+                  <pic:blipFill>
+                    <a:blip r:embed="rId8"/>
+                    <a:stretch>
+                      <a:fillRect/>
+                    </a:stretch>
+                  </pic:blipFill>
+                  <pic:spPr>
+                    <a:xfrm>
+                      <a:off x="0" y="0"/>
+                      <a:ext cx="6115050" cy="603885"/>
+                    </a:xfrm>
+                    <a:prstGeom prst="rect">
+                      <a:avLst/>
+                    </a:prstGeom>
+                  </pic:spPr>
+                </pic:pic>
+              </a:graphicData>
+            </a:graphic>
+          </wp:inline>
+        </w:drawing>
+      </w:r>
+    </w:p>
+    <w:p>
+      <w:pPr>
+        <w:pStyle w:val="Heading2"/>
+        <w:ind w:firstLine="0"/>
+        <w:rPr>
+          <w:rFonts w:ascii="Times New Roman" w:hAnsi="Times New Roman" w:cs="Times New Roman"/>
+          <w:b/>
+          <w:color w:val="auto"/>
+          <w:sz w:val="26"/>
+          <w:szCs w:val="26"/>
+        </w:rPr>
+      </w:pPr>
+      <w:r>
+        <w:rPr>
+          <w:rFonts w:ascii="Times New Roman" w:hAnsi="Times New Roman" w:cs="Times New Roman"/>
+          <w:b/>
+          <w:color w:val="auto"/>
+          <w:sz w:val="26"/>
+          <w:szCs w:val="26"/>
+        </w:rPr>
+        <w:t>4</w:t>
+      </w:r>
+      <w:r>
+        <w:rPr>
+          <w:rFonts w:ascii="Times New Roman" w:hAnsi="Times New Roman" w:cs="Times New Roman"/>
+          <w:b/>
+          <w:color w:val="auto"/>
+          <w:sz w:val="26"/>
+          <w:szCs w:val="26"/>
+        </w:rPr>
+        <w:t>.</w:t>
+      </w:r>
+    </w:p>
+    <w:p>
+      <w:pPr>
+        <w:ind w:firstLine="0"/>
+      </w:pPr>
+      <w:r>
+        <w:drawing>
+          <wp:inline distT="0" distB="0" distL="0" distR="0" wp14:anchorId="35ED35B9" wp14:editId="605ED00E">
+            <wp:extent cx="6115050" cy="353060"/>
+            <wp:effectExtent l="0" t="0" r="0" b="8890"/>
+            <wp:docPr id="21" name="Picture 21"/>
+            <wp:cNvGraphicFramePr>
+              <a:graphicFrameLocks xmlns:a="http://schemas.openxmlformats.org/drawingml/2006/main" noChangeAspect="1"/>
+            </wp:cNvGraphicFramePr>
+            <a:graphic xmlns:a="http://schemas.openxmlformats.org/drawingml/2006/main">
+              <a:graphicData uri="http://schemas.openxmlformats.org/drawingml/2006/picture">
+                <pic:pic xmlns:pic="http://schemas.openxmlformats.org/drawingml/2006/picture">
+                  <pic:nvPicPr>
+                    <pic:cNvPr id="1" name=""/>
+                    <pic:cNvPicPr/>
+                  </pic:nvPicPr>
+                  <pic:blipFill>
+                    <a:blip r:embed="rId9"/>
+                    <a:stretch>
+                      <a:fillRect/>
+                    </a:stretch>
+                  </pic:blipFill>
+                  <pic:spPr>
+                    <a:xfrm>
+                      <a:off x="0" y="0"/>
+                      <a:ext cx="6115050" cy="353060"/>
+                    </a:xfrm>
+                    <a:prstGeom prst="rect">
+                      <a:avLst/>
+                    </a:prstGeom>
+                  </pic:spPr>
+                </pic:pic>
+              </a:graphicData>
+            </a:graphic>
+          </wp:inline>
+        </w:drawing>
+      </w:r>
+    </w:p>
+    <w:p>
+      <w:pPr>
+        <w:pStyle w:val="Heading2"/>
+        <w:ind w:firstLine="0"/>
+        <w:rPr>
+          <w:rFonts w:ascii="Times New Roman" w:hAnsi="Times New Roman" w:cs="Times New Roman"/>
+          <w:b/>
+          <w:color w:val="auto"/>
+          <w:sz w:val="26"/>
+          <w:szCs w:val="26"/>
+        </w:rPr>
+      </w:pPr>
+      <w:r>
+        <w:rPr>
+          <w:rFonts w:ascii="Times New Roman" w:hAnsi="Times New Roman" w:cs="Times New Roman"/>
+          <w:b/>
+          <w:color w:val="auto"/>
+          <w:sz w:val="26"/>
+          <w:szCs w:val="26"/>
+        </w:rPr>
+        <w:t>5.</w:t>
+      </w:r>
+    </w:p>
+    <w:p>
+      <w:pPr>
+        <w:ind w:firstLine="0"/>
+      </w:pPr>
+      <w:r>
+        <w:drawing>
+          <wp:inline distT="0" distB="0" distL="0" distR="0" wp14:anchorId="721E16DA" wp14:editId="7D0DEEE8">
+            <wp:extent cx="6115050" cy="660400"/>
+            <wp:effectExtent l="0" t="0" r="0" b="6350"/>
+            <wp:docPr id="22" name="Picture 22"/>
+            <wp:cNvGraphicFramePr>
+              <a:graphicFrameLocks xmlns:a="http://schemas.openxmlformats.org/drawingml/2006/main" noChangeAspect="1"/>
+            </wp:cNvGraphicFramePr>
+            <a:graphic xmlns:a="http://schemas.openxmlformats.org/drawingml/2006/main">
+              <a:graphicData uri="http://schemas.openxmlformats.org/drawingml/2006/picture">
+                <pic:pic xmlns:pic="http://schemas.openxmlformats.org/drawingml/2006/picture">
+                  <pic:nvPicPr>
+                    <pic:cNvPr id="1" name=""/>
+                    <pic:cNvPicPr/>
+                  </pic:nvPicPr>
+                  <pic:blipFill>
+                    <a:blip r:embed="rId10"/>
+                    <a:stretch>
+                      <a:fillRect/>
+                    </a:stretch>
+                  </pic:blipFill>
+                  <pic:spPr>
+                    <a:xfrm>
+                      <a:off x="0" y="0"/>
+                      <a:ext cx="6115050" cy="660400"/>
+                    </a:xfrm>
+                    <a:prstGeom prst="rect">
+                      <a:avLst/>
+                    </a:prstGeom>
+                  </pic:spPr>
+                </pic:pic>
+              </a:graphicData>
+            </a:graphic>
+          </wp:inline>
+        </w:drawing>
+      </w:r>
+    </w:p>
+    <w:p>
+      <w:pPr>
+        <w:pStyle w:val="Heading2"/>
+        <w:ind w:firstLine="0"/>
+        <w:rPr>
+          <w:rFonts w:ascii="Times New Roman" w:hAnsi="Times New Roman" w:cs="Times New Roman"/>
+          <w:b/>
+          <w:color w:val="auto"/>
+          <w:sz w:val="26"/>
+          <w:szCs w:val="26"/>
+        </w:rPr>
+      </w:pPr>
+      <w:r>
+        <w:rPr>
+          <w:rFonts w:ascii="Times New Roman" w:hAnsi="Times New Roman" w:cs="Times New Roman"/>
+          <w:b/>
+          <w:color w:val="auto"/>
+          <w:sz w:val="26"/>
+          <w:szCs w:val="26"/>
+        </w:rPr>
+        <w:t>6.</w:t>
+      </w:r>
+    </w:p>
+    <w:p>
+      <w:pPr>
+        <w:ind w:firstLine="0"/>
+      </w:pPr>
+      <w:r>
+        <w:drawing>
+          <wp:inline distT="0" distB="0" distL="0" distR="0" wp14:anchorId="3B433FB4" wp14:editId="07DFC0BB">
+            <wp:extent cx="6115050" cy="542925"/>
+            <wp:effectExtent l="0" t="0" r="0" b="9525"/>
+            <wp:docPr id="23" name="Picture 23"/>
+            <wp:cNvGraphicFramePr>
+              <a:graphicFrameLocks xmlns:a="http://schemas.openxmlformats.org/drawingml/2006/main" noChangeAspect="1"/>
+            </wp:cNvGraphicFramePr>
+            <a:graphic xmlns:a="http://schemas.openxmlformats.org/drawingml/2006/main">
+              <a:graphicData uri="http://schemas.openxmlformats.org/drawingml/2006/picture">
+                <pic:pic xmlns:pic="http://schemas.openxmlformats.org/drawingml/2006/picture">
+                  <pic:nvPicPr>
+                    <pic:cNvPr id="1" name=""/>
+                    <pic:cNvPicPr/>
+                  </pic:nvPicPr>
+                  <pic:blipFill>
+                    <a:blip r:embed="rId11"/>
+                    <a:stretch>
+                      <a:fillRect/>
+                    </a:stretch>
+                  </pic:blipFill>
+                  <pic:spPr>
+                    <a:xfrm>
+                      <a:off x="0" y="0"/>
+                      <a:ext cx="6115050" cy="542925"/>
+                    </a:xfrm>
+                    <a:prstGeom prst="rect">
+                      <a:avLst/>
+                    </a:prstGeom>
+                  </pic:spPr>
+                </pic:pic>
+              </a:graphicData>
+            </a:graphic>
+          </wp:inline>
+        </w:drawing>
+      </w:r>
+    </w:p>
+    <w:p>
+      <w:pPr>
+        <w:pStyle w:val="Heading2"/>
+        <w:ind w:firstLine="0"/>
+        <w:rPr>
+          <w:rFonts w:ascii="Times New Roman" w:hAnsi="Times New Roman" w:cs="Times New Roman"/>
+          <w:b/>
+          <w:color w:val="auto"/>
+          <w:sz w:val="26"/>
+          <w:szCs w:val="26"/>
+        </w:rPr>
+      </w:pPr>
+      <w:r>
+        <w:rPr>
+          <w:rFonts w:ascii="Times New Roman" w:hAnsi="Times New Roman" w:cs="Times New Roman"/>
+          <w:b/>
+          <w:color w:val="auto"/>
+          <w:sz w:val="26"/>
+          <w:szCs w:val="26"/>
+        </w:rPr>
+        <w:lastRenderedPageBreak/>
+        <w:t>7.</w:t>
+      </w:r>
+    </w:p>
+    <w:p>
+      <w:pPr>
+        <w:ind w:firstLine="0"/>
+      </w:pPr>
+      <w:r>
+        <w:drawing>
+          <wp:inline distT="0" distB="0" distL="0" distR="0" wp14:anchorId="42E74701" wp14:editId="758EF0BD">
+            <wp:extent cx="6115050" cy="3439795"/>
+            <wp:effectExtent l="0" t="0" r="0" b="8255"/>
+            <wp:docPr id="24" name="Picture 24"/>
+            <wp:cNvGraphicFramePr>
+              <a:graphicFrameLocks xmlns:a="http://schemas.openxmlformats.org/drawingml/2006/main" noChangeAspect="1"/>
+            </wp:cNvGraphicFramePr>
+            <a:graphic xmlns:a="http://schemas.openxmlformats.org/drawingml/2006/main">
+              <a:graphicData uri="http://schemas.openxmlformats.org/drawingml/2006/picture">
+                <pic:pic xmlns:pic="http://schemas.openxmlformats.org/drawingml/2006/picture">
+                  <pic:nvPicPr>
+                    <pic:cNvPr id="1" name=""/>
+                    <pic:cNvPicPr/>
+                  </pic:nvPicPr>
+                  <pic:blipFill>
+                    <a:blip r:embed="rId12"/>
+                    <a:stretch>
+                      <a:fillRect/>
+                    </a:stretch>
+                  </pic:blipFill>
+                  <pic:spPr>
+                    <a:xfrm>
+                      <a:off x="0" y="0"/>
+                      <a:ext cx="6115050" cy="3439795"/>
+                    </a:xfrm>
+                    <a:prstGeom prst="rect">
+                      <a:avLst/>
+                    </a:prstGeom>
+                  </pic:spPr>
+                </pic:pic>
+              </a:graphicData>
+            </a:graphic>
+          </wp:inline>
+        </w:drawing>
+      </w:r>
+    </w:p>
+    <w:p>
+      <w:pPr>
+        <w:pStyle w:val="Heading2"/>
+        <w:ind w:firstLine="0"/>
+        <w:rPr>
+          <w:rFonts w:ascii="Times New Roman" w:hAnsi="Times New Roman" w:cs="Times New Roman"/>
+          <w:b/>
+          <w:color w:val="auto"/>
+          <w:sz w:val="26"/>
+          <w:szCs w:val="26"/>
+        </w:rPr>
+      </w:pPr>
+      <w:r>
+        <w:rPr>
+          <w:rFonts w:ascii="Times New Roman" w:hAnsi="Times New Roman" w:cs="Times New Roman"/>
+          <w:b/>
+          <w:color w:val="auto"/>
+          <w:sz w:val="26"/>
+          <w:szCs w:val="26"/>
+        </w:rPr>
+        <w:t>8.</w:t>
+      </w:r>
+    </w:p>
+    <w:p>
+      <w:pPr>
+        <w:ind w:firstLine="0"/>
+      </w:pPr>
+      <w:r>
+        <w:drawing>
+          <wp:inline distT="0" distB="0" distL="0" distR="0" wp14:anchorId="2913CA58" wp14:editId="5A5D7168">
+            <wp:extent cx="6115050" cy="359410"/>
+            <wp:effectExtent l="0" t="0" r="0" b="2540"/>
+            <wp:docPr id="25" name="Picture 25"/>
+            <wp:cNvGraphicFramePr>
+              <a:graphicFrameLocks xmlns:a="http://schemas.openxmlformats.org/drawingml/2006/main" noChangeAspect="1"/>
+            </wp:cNvGraphicFramePr>
+            <a:graphic xmlns:a="http://schemas.openxmlformats.org/drawingml/2006/main">
+              <a:graphicData uri="http://schemas.openxmlformats.org/drawingml/2006/picture">
+                <pic:pic xmlns:pic="http://schemas.openxmlformats.org/drawingml/2006/picture">
+                  <pic:nvPicPr>
+                    <pic:cNvPr id="1" name=""/>
+                    <pic:cNvPicPr/>
+                  </pic:nvPicPr>
+                  <pic:blipFill>
+                    <a:blip r:embed="rId13"/>
+                    <a:stretch>
+                      <a:fillRect/>
+                    </a:stretch>
+                  </pic:blipFill>
+                  <pic:spPr>
+                    <a:xfrm>
+                      <a:off x="0" y="0"/>
+                      <a:ext cx="6115050" cy="359410"/>
+                    </a:xfrm>
+                    <a:prstGeom prst="rect">
+                      <a:avLst/>
+                    </a:prstGeom>
+                  </pic:spPr>
+                </pic:pic>
+              </a:graphicData>
+            </a:graphic>
+          </wp:inline>
+        </w:drawing>
+      </w:r>
+    </w:p>
+    <w:p>
+      <w:pPr>
+        <w:pStyle w:val="Heading2"/>
+        <w:ind w:firstLine="0"/>
+        <w:rPr>
+          <w:rFonts w:ascii="Times New Roman" w:hAnsi="Times New Roman" w:cs="Times New Roman"/>
+          <w:b/>
+          <w:color w:val="auto"/>
+          <w:sz w:val="26"/>
+          <w:szCs w:val="26"/>
+        </w:rPr>
+      </w:pPr>
+      <w:r>
+        <w:rPr>
+          <w:rFonts w:ascii="Times New Roman" w:hAnsi="Times New Roman" w:cs="Times New Roman"/>
+          <w:b/>
+          <w:color w:val="auto"/>
+          <w:sz w:val="26"/>
+          <w:szCs w:val="26"/>
+        </w:rPr>
+        <w:t>9.</w:t>
+      </w:r>
+    </w:p>
+    <w:p>
+      <w:pPr>
+        <w:ind w:firstLine="0"/>
+      </w:pPr>
+      <w:r>
+        <w:drawing>
+          <wp:inline distT="0" distB="0" distL="0" distR="0" wp14:anchorId="6DAB1B51" wp14:editId="5843E776">
+            <wp:extent cx="6011114" cy="866896"/>
+            <wp:effectExtent l="0" t="0" r="8890" b="9525"/>
+            <wp:docPr id="26" name="Picture 26"/>
+            <wp:cNvGraphicFramePr>
+              <a:graphicFrameLocks xmlns:a="http://schemas.openxmlformats.org/drawingml/2006/main" noChangeAspect="1"/>
+            </wp:cNvGraphicFramePr>
+            <a:graphic xmlns:a="http://schemas.openxmlformats.org/drawingml/2006/main">
+              <a:graphicData uri="http://schemas.openxmlformats.org/drawingml/2006/picture">
+                <pic:pic xmlns:pic="http://schemas.openxmlformats.org/drawingml/2006/picture">
+                  <pic:nvPicPr>
+                    <pic:cNvPr id="1" name=""/>
+                    <pic:cNvPicPr/>
+                  </pic:nvPicPr>
+                  <pic:blipFill>
+                    <a:blip r:embed="rId14"/>
+                    <a:stretch>
+                      <a:fillRect/>
+                    </a:stretch>
+                  </pic:blipFill>
+                  <pic:spPr>
+                    <a:xfrm>
+                      <a:off x="0" y="0"/>
+                      <a:ext cx="6011114" cy="866896"/>
+                    </a:xfrm>
+                    <a:prstGeom prst="rect">
+                      <a:avLst/>
+                    </a:prstGeom>
+                  </pic:spPr>
+                </pic:pic>
+              </a:graphicData>
+            </a:graphic>
+          </wp:inline>
+        </w:drawing>
+      </w:r>
+    </w:p>
+    <w:p>
+      <w:pPr>
+        <w:pStyle w:val="Heading2"/>
+        <w:ind w:firstLine="0"/>
+        <w:rPr>
+          <w:rFonts w:ascii="Times New Roman" w:hAnsi="Times New Roman" w:cs="Times New Roman"/>
+          <w:b/>
+          <w:color w:val="auto"/>
+          <w:sz w:val="26"/>
+          <w:szCs w:val="26"/>
+        </w:rPr>
+      </w:pPr>
+      <w:r>
+        <w:rPr>
+          <w:rFonts w:ascii="Times New Roman" w:hAnsi="Times New Roman" w:cs="Times New Roman"/>
+          <w:b/>
+          <w:color w:val="auto"/>
+          <w:sz w:val="26"/>
+          <w:szCs w:val="26"/>
+        </w:rPr>
+        <w:t>10.</w:t>
+      </w:r>
+    </w:p>
+    <w:p>
+      <w:pPr>
+        <w:ind w:firstLine="0"/>
+      </w:pPr>
+      <w:r>
+        <w:drawing>
+          <wp:inline distT="0" distB="0" distL="0" distR="0" wp14:anchorId="64FA9BA2" wp14:editId="438A21F3">
+            <wp:extent cx="6115050" cy="640715"/>
+            <wp:effectExtent l="0" t="0" r="0" b="6985"/>
+            <wp:docPr id="27" name="Picture 27"/>
+            <wp:cNvGraphicFramePr>
+              <a:graphicFrameLocks xmlns:a="http://schemas.openxmlformats.org/drawingml/2006/main" noChangeAspect="1"/>
+            </wp:cNvGraphicFramePr>
+            <a:graphic xmlns:a="http://schemas.openxmlformats.org/drawingml/2006/main">
+              <a:graphicData uri="http://schemas.openxmlformats.org/drawingml/2006/picture">
+                <pic:pic xmlns:pic="http://schemas.openxmlformats.org/drawingml/2006/picture">
+                  <pic:nvPicPr>
+                    <pic:cNvPr id="1" name=""/>
+                    <pic:cNvPicPr/>
+                  </pic:nvPicPr>
+                  <pic:blipFill>
+                    <a:blip r:embed="rId15"/>
+                    <a:stretch>
+                      <a:fillRect/>
+                    </a:stretch>
+                  </pic:blipFill>
+                  <pic:spPr>
+                    <a:xfrm>
+                      <a:off x="0" y="0"/>
+                      <a:ext cx="6115050" cy="640715"/>
+                    </a:xfrm>
+                    <a:prstGeom prst="rect">
+                      <a:avLst/>
+                    </a:prstGeom>
+                  </pic:spPr>
+                </pic:pic>
+              </a:graphicData>
+            </a:graphic>
+          </wp:inline>
+        </w:drawing>
+      </w:r>
+    </w:p>
+    <w:p>
+      <w:pPr>
+        <w:pStyle w:val="Heading2"/>
+        <w:ind w:firstLine="0"/>
+        <w:rPr>
+          <w:rFonts w:ascii="Times New Roman" w:hAnsi="Times New Roman" w:cs="Times New Roman"/>
+          <w:b/>
+          <w:color w:val="auto"/>
+          <w:sz w:val="26"/>
+          <w:szCs w:val="26"/>
+        </w:rPr>
+      </w:pPr>
+      <w:r>
+        <w:rPr>
+          <w:rFonts w:ascii="Times New Roman" w:hAnsi="Times New Roman" w:cs="Times New Roman"/>
+          <w:b/>
+          <w:color w:val="auto"/>
+          <w:sz w:val="26"/>
+          <w:szCs w:val="26"/>
+        </w:rPr>
+        <w:t>11.</w:t>
+      </w:r>
+    </w:p>
+    <w:p>
+      <w:pPr>
+        <w:ind w:firstLine="0"/>
+      </w:pPr>
+      <w:r>
+        <w:drawing>
+          <wp:inline distT="0" distB="0" distL="0" distR="0" wp14:anchorId="4EEC8679" wp14:editId="4A14B981">
+            <wp:extent cx="6115050" cy="1077595"/>
+            <wp:effectExtent l="0" t="0" r="0" b="8255"/>
+            <wp:docPr id="28" name="Picture 28"/>
+            <wp:cNvGraphicFramePr>
+              <a:graphicFrameLocks xmlns:a="http://schemas.openxmlformats.org/drawingml/2006/main" noChangeAspect="1"/>
+            </wp:cNvGraphicFramePr>
+            <a:graphic xmlns:a="http://schemas.openxmlformats.org/drawingml/2006/main">
+              <a:graphicData uri="http://schemas.openxmlformats.org/drawingml/2006/picture">
+                <pic:pic xmlns:pic="http://schemas.openxmlformats.org/drawingml/2006/picture">
+                  <pic:nvPicPr>
+                    <pic:cNvPr id="1" name=""/>
+                    <pic:cNvPicPr/>
+                  </pic:nvPicPr>
+                  <pic:blipFill>
+                    <a:blip r:embed="rId16"/>
+                    <a:stretch>
+                      <a:fillRect/>
+                    </a:stretch>
+                  </pic:blipFill>
+                  <pic:spPr>
+                    <a:xfrm>
+                      <a:off x="0" y="0"/>
+                      <a:ext cx="6115050" cy="1077595"/>
+                    </a:xfrm>
+                    <a:prstGeom prst="rect">
+                      <a:avLst/>
+                    </a:prstGeom>
+                  </pic:spPr>
+                </pic:pic>
+              </a:graphicData>
+            </a:graphic>
+          </wp:inline>
+        </w:drawing>
+      </w:r>
+    </w:p>
+    <w:p>
+      <w:pPr>
+        <w:pStyle w:val="Heading2"/>
+        <w:ind w:firstLine="0"/>
+        <w:rPr>
+          <w:rFonts w:ascii="Times New Roman" w:hAnsi="Times New Roman" w:cs="Times New Roman"/>
+          <w:b/>
+          <w:color w:val="auto"/>
+          <w:sz w:val="26"/>
+          <w:szCs w:val="26"/>
+        </w:rPr>
+      </w:pPr>
+      <w:r>
+        <w:rPr>
+          <w:rFonts w:ascii="Times New Roman" w:hAnsi="Times New Roman" w:cs="Times New Roman"/>
+          <w:b/>
+          <w:color w:val="auto"/>
+          <w:sz w:val="26"/>
+          <w:szCs w:val="26"/>
+        </w:rPr>
+        <w:t>12.</w:t>
+      </w:r>
+    </w:p>
+    <w:p>
+      <w:pPr>
+        <w:ind w:firstLine="0"/>
+      </w:pPr>
+      <w:r>
+        <w:drawing>
+          <wp:inline distT="0" distB="0" distL="0" distR="0" wp14:anchorId="08FB3256" wp14:editId="36FF4CF7">
+            <wp:extent cx="6115050" cy="268605"/>
+            <wp:effectExtent l="0" t="0" r="0" b="0"/>
+            <wp:docPr id="29" name="Picture 29"/>
+            <wp:cNvGraphicFramePr>
+              <a:graphicFrameLocks xmlns:a="http://schemas.openxmlformats.org/drawingml/2006/main" noChangeAspect="1"/>
+            </wp:cNvGraphicFramePr>
+            <a:graphic xmlns:a="http://schemas.openxmlformats.org/drawingml/2006/main">
+              <a:graphicData uri="http://schemas.openxmlformats.org/drawingml/2006/picture">
+                <pic:pic xmlns:pic="http://schemas.openxmlformats.org/drawingml/2006/picture">
+                  <pic:nvPicPr>
+                    <pic:cNvPr id="1" name=""/>
+                    <pic:cNvPicPr/>
+                  </pic:nvPicPr>
+                  <pic:blipFill>
+                    <a:blip r:embed="rId17"/>
+                    <a:stretch>
+                      <a:fillRect/>
+                    </a:stretch>
+                  </pic:blipFill>
+                  <pic:spPr>
+                    <a:xfrm>
+                      <a:off x="0" y="0"/>
+                      <a:ext cx="6115050" cy="268605"/>
+                    </a:xfrm>
+                    <a:prstGeom prst="rect">
+                      <a:avLst/>
+                    </a:prstGeom>
+                  </pic:spPr>
+                </pic:pic>
+              </a:graphicData>
+            </a:graphic>
+          </wp:inline>
+        </w:drawing>
+      </w:r>
+    </w:p>
+    <w:p>
+      <w:pPr>
+        <w:pStyle w:val="Heading2"/>
+        <w:ind w:firstLine="0"/>
+        <w:rPr>
+          <w:rFonts w:ascii="Times New Roman" w:hAnsi="Times New Roman" w:cs="Times New Roman"/>
+          <w:b/>
+          <w:color w:val="auto"/>
+          <w:sz w:val="26"/>
+          <w:szCs w:val="26"/>
+        </w:rPr>
+      </w:pPr>
+      <w:r>
+        <w:rPr>
+          <w:rFonts w:ascii="Times New Roman" w:hAnsi="Times New Roman" w:cs="Times New Roman"/>
+          <w:b/>
+          <w:color w:val="auto"/>
+          <w:sz w:val="26"/>
+          <w:szCs w:val="26"/>
+        </w:rPr>
+        <w:lastRenderedPageBreak/>
+        <w:t>13.</w:t>
+      </w:r>
+    </w:p>
+    <w:p>
+      <w:pPr>
+        <w:ind w:firstLine="0"/>
+      </w:pPr>
+      <w:r>
+        <w:drawing>
+          <wp:inline distT="0" distB="0" distL="0" distR="0" wp14:anchorId="331721C0" wp14:editId="4FC98D2B">
+            <wp:extent cx="6115050" cy="634365"/>
+            <wp:effectExtent l="0" t="0" r="0" b="0"/>
+            <wp:docPr id="30" name="Picture 30"/>
+            <wp:cNvGraphicFramePr>
+              <a:graphicFrameLocks xmlns:a="http://schemas.openxmlformats.org/drawingml/2006/main" noChangeAspect="1"/>
+            </wp:cNvGraphicFramePr>
+            <a:graphic xmlns:a="http://schemas.openxmlformats.org/drawingml/2006/main">
+              <a:graphicData uri="http://schemas.openxmlformats.org/drawingml/2006/picture">
+                <pic:pic xmlns:pic="http://schemas.openxmlformats.org/drawingml/2006/picture">
+                  <pic:nvPicPr>
+                    <pic:cNvPr id="1" name=""/>
+                    <pic:cNvPicPr/>
+                  </pic:nvPicPr>
+                  <pic:blipFill>
+                    <a:blip r:embed="rId18"/>
+                    <a:stretch>
+                      <a:fillRect/>
+                    </a:stretch>
+                  </pic:blipFill>
+                  <pic:spPr>
+                    <a:xfrm>
+                      <a:off x="0" y="0"/>
+                      <a:ext cx="6115050" cy="634365"/>
+                    </a:xfrm>
+                    <a:prstGeom prst="rect">
+                      <a:avLst/>
+                    </a:prstGeom>
+                  </pic:spPr>
+                </pic:pic>
+              </a:graphicData>
+            </a:graphic>
+          </wp:inline>
+        </w:drawing>
+      </w:r>
+    </w:p>
+    <w:p>
+      <w:pPr>
+        <w:pStyle w:val="Heading2"/>
+        <w:ind w:firstLine="0"/>
+        <w:rPr>
+          <w:rFonts w:ascii="Times New Roman" w:hAnsi="Times New Roman" w:cs="Times New Roman"/>
+          <w:b/>
+          <w:color w:val="auto"/>
+          <w:sz w:val="26"/>
+          <w:szCs w:val="26"/>
+        </w:rPr>
+      </w:pPr>
+      <w:r>
+        <w:rPr>
+          <w:rFonts w:ascii="Times New Roman" w:hAnsi="Times New Roman" w:cs="Times New Roman"/>
+          <w:b/>
+          <w:color w:val="auto"/>
+          <w:sz w:val="26"/>
+          <w:szCs w:val="26"/>
+        </w:rPr>
+        <w:t>14.</w:t>
+      </w:r>
+    </w:p>
+    <w:p>
+      <w:pPr>
+        <w:ind w:firstLine="0"/>
+      </w:pPr>
+      <w:r>
+        <w:drawing>
+          <wp:inline distT="0" distB="0" distL="0" distR="0" wp14:anchorId="30B7FA76" wp14:editId="4943F6E8">
+            <wp:extent cx="6115050" cy="2033270"/>
+            <wp:effectExtent l="0" t="0" r="0" b="5080"/>
+            <wp:docPr id="31" name="Picture 31"/>
+            <wp:cNvGraphicFramePr>
+              <a:graphicFrameLocks xmlns:a="http://schemas.openxmlformats.org/drawingml/2006/main" noChangeAspect="1"/>
+            </wp:cNvGraphicFramePr>
+            <a:graphic xmlns:a="http://schemas.openxmlformats.org/drawingml/2006/main">
+              <a:graphicData uri="http://schemas.openxmlformats.org/drawingml/2006/picture">
+                <pic:pic xmlns:pic="http://schemas.openxmlformats.org/drawingml/2006/picture">
+                  <pic:nvPicPr>
+                    <pic:cNvPr id="1" name=""/>
+                    <pic:cNvPicPr/>
+                  </pic:nvPicPr>
+                  <pic:blipFill>
+                    <a:blip r:embed="rId19"/>
+                    <a:stretch>
+                      <a:fillRect/>
+                    </a:stretch>
+                  </pic:blipFill>
+                  <pic:spPr>
+                    <a:xfrm>
+                      <a:off x="0" y="0"/>
+                      <a:ext cx="6115050" cy="2033270"/>
+                    </a:xfrm>
+                    <a:prstGeom prst="rect">
+                      <a:avLst/>
+                    </a:prstGeom>
+                  </pic:spPr>
+                </pic:pic>
+              </a:graphicData>
+            </a:graphic>
+          </wp:inline>
+        </w:drawing>
+      </w:r>
+    </w:p>
+    <w:p>
+      <w:pPr>
+        <w:pStyle w:val="Heading2"/>
+        <w:ind w:firstLine="0"/>
+        <w:rPr>
+          <w:rFonts w:ascii="Times New Roman" w:hAnsi="Times New Roman" w:cs="Times New Roman"/>
+          <w:b/>
+          <w:color w:val="auto"/>
+          <w:sz w:val="26"/>
+          <w:szCs w:val="26"/>
+        </w:rPr>
+      </w:pPr>
+      <w:r>
+        <w:rPr>
+          <w:rFonts w:ascii="Times New Roman" w:hAnsi="Times New Roman" w:cs="Times New Roman"/>
+          <w:b/>
+          <w:color w:val="auto"/>
+          <w:sz w:val="26"/>
+          <w:szCs w:val="26"/>
+        </w:rPr>
+        <w:t>15.</w:t>
+      </w:r>
+    </w:p>
+    <w:p>
+      <w:pPr>
+        <w:ind w:firstLine="0"/>
+      </w:pPr>
+      <w:r>
+        <w:drawing>
+          <wp:inline distT="0" distB="0" distL="0" distR="0" wp14:anchorId="33586417" wp14:editId="40907E4F">
+            <wp:extent cx="6115050" cy="580390"/>
+            <wp:effectExtent l="0" t="0" r="0" b="0"/>
+            <wp:docPr id="32" name="Picture 32"/>
+            <wp:cNvGraphicFramePr>
+              <a:graphicFrameLocks xmlns:a="http://schemas.openxmlformats.org/drawingml/2006/main" noChangeAspect="1"/>
+            </wp:cNvGraphicFramePr>
+            <a:graphic xmlns:a="http://schemas.openxmlformats.org/drawingml/2006/main">
+              <a:graphicData uri="http://schemas.openxmlformats.org/drawingml/2006/picture">
+                <pic:pic xmlns:pic="http://schemas.openxmlformats.org/drawingml/2006/picture">
+                  <pic:nvPicPr>
+                    <pic:cNvPr id="1" name=""/>
+                    <pic:cNvPicPr/>
+                  </pic:nvPicPr>
+                  <pic:blipFill>
+                    <a:blip r:embed="rId20"/>
+                    <a:stretch>
+                      <a:fillRect/>
+                    </a:stretch>
+                  </pic:blipFill>
+                  <pic:spPr>
+                    <a:xfrm>
+                      <a:off x="0" y="0"/>
+                      <a:ext cx="6115050" cy="580390"/>
+                    </a:xfrm>
+                    <a:prstGeom prst="rect">
+                      <a:avLst/>
+                    </a:prstGeom>
+                  </pic:spPr>
+                </pic:pic>
+              </a:graphicData>
+            </a:graphic>
+          </wp:inline>
+        </w:drawing>
+      </w:r>
+    </w:p>
+    <w:p>
+      <w:pPr>
+        <w:ind w:firstLine="0"/>
+      </w:pPr>
+      <w:r>
+        <w:br w:type="page"/>
+      </w:r>
+    </w:p>
+    <w:p>
+      <w:pPr>
+        <w:pStyle w:val="Heading1"/>
+        <w:ind w:firstLine="0"/>
+      </w:pPr>
+      <w:r>
+        <w:lastRenderedPageBreak/>
+        <w:t xml:space="preserve">Phần </w:t>
+      </w:r>
+      <w:r>
+        <w:t>2</w:t>
+      </w:r>
+      <w:r>
+        <w:t xml:space="preserve">: </w:t>
+      </w:r>
+      <w:r>
+        <w:t>Docker compose file</w:t>
+      </w:r>
+      <w:r>
+        <w:t>:</w:t>
+      </w:r>
+    </w:p>
+    <w:p>
+      <w:pPr>
+        <w:pStyle w:val="Heading2"/>
+        <w:ind w:firstLine="0"/>
+        <w:rPr>
+          <w:rFonts w:ascii="Times New Roman" w:hAnsi="Times New Roman" w:cs="Times New Roman"/>
+          <w:b/>
+          <w:color w:val="auto"/>
+          <w:sz w:val="26"/>
+          <w:szCs w:val="26"/>
+        </w:rPr>
+      </w:pPr>
+      <w:r>
+        <w:rPr>
+          <w:rFonts w:ascii="Times New Roman" w:hAnsi="Times New Roman" w:cs="Times New Roman"/>
+          <w:b/>
+          <w:color w:val="auto"/>
+          <w:sz w:val="26"/>
+          <w:szCs w:val="26"/>
+        </w:rPr>
+        <w:t>1.</w:t>
+      </w:r>
+    </w:p>
+    <w:p>
+      <w:pPr>
+        <w:ind w:firstLine="0"/>
+      </w:pPr>
+      <w:r>
+        <w:drawing>
+          <wp:inline distT="0" distB="0" distL="0" distR="0" wp14:anchorId="41928012" wp14:editId="198D072D">
+            <wp:extent cx="6115050" cy="3439795"/>
+            <wp:effectExtent l="0" t="0" r="0" b="8255"/>
+            <wp:docPr id="1" name="Picture 1"/>
+            <wp:cNvGraphicFramePr>
+              <a:graphicFrameLocks xmlns:a="http://schemas.openxmlformats.org/drawingml/2006/main" noChangeAspect="1"/>
+            </wp:cNvGraphicFramePr>
+            <a:graphic xmlns:a="http://schemas.openxmlformats.org/drawingml/2006/main">
+              <a:graphicData uri="http://schemas.openxmlformats.org/drawingml/2006/picture">
+                <pic:pic xmlns:pic="http://schemas.openxmlformats.org/drawingml/2006/picture">
+                  <pic:nvPicPr>
+                    <pic:cNvPr id="1" name=""/>
+                    <pic:cNvPicPr/>
+                  </pic:nvPicPr>
+                  <pic:blipFill>
+                    <a:blip r:embed="rId21"/>
+                    <a:stretch>
+                      <a:fillRect/>
+                    </a:stretch>
+                  </pic:blipFill>
+                  <pic:spPr>
+                    <a:xfrm>
+                      <a:off x="0" y="0"/>
+                      <a:ext cx="6115050" cy="3439795"/>
+                    </a:xfrm>
+                    <a:prstGeom prst="rect">
+                      <a:avLst/>
+                    </a:prstGeom>
+                  </pic:spPr>
+                </pic:pic>
+              </a:graphicData>
+            </a:graphic>
+          </wp:inline>
+        </w:drawing>
+      </w:r>
+    </w:p>
+    <w:p>
+      <w:pPr>
+        <w:pStyle w:val="Heading2"/>
+        <w:ind w:firstLine="0"/>
+        <w:rPr>
+          <w:rFonts w:ascii="Times New Roman" w:hAnsi="Times New Roman" w:cs="Times New Roman"/>
+          <w:b/>
+          <w:color w:val="auto"/>
+          <w:sz w:val="26"/>
+          <w:szCs w:val="26"/>
+        </w:rPr>
+      </w:pPr>
+      <w:r>
+        <w:rPr>
+          <w:rFonts w:ascii="Times New Roman" w:hAnsi="Times New Roman" w:cs="Times New Roman"/>
+          <w:b/>
+          <w:color w:val="auto"/>
+          <w:sz w:val="26"/>
+          <w:szCs w:val="26"/>
+        </w:rPr>
+        <w:t>2</w:t>
+      </w:r>
+      <w:r>
+        <w:rPr>
+          <w:rFonts w:ascii="Times New Roman" w:hAnsi="Times New Roman" w:cs="Times New Roman"/>
+          <w:b/>
+          <w:color w:val="auto"/>
+          <w:sz w:val="26"/>
+          <w:szCs w:val="26"/>
+        </w:rPr>
+        <w:t>.</w:t>
+      </w:r>
+    </w:p>
+    <w:p>
+      <w:pPr>
         <w:ind w:firstLine="0"/>
       </w:pPr>
       <w:bookmarkStart w:id="0" w:name="_GoBack"/>
       <w:bookmarkEnd w:id="0"/>
+    </w:p>
+    <w:p>
+      <w:pPr>
+        <w:pStyle w:val="Heading2"/>
+        <w:ind w:firstLine="0"/>
+        <w:rPr>
+          <w:rFonts w:ascii="Times New Roman" w:hAnsi="Times New Roman" w:cs="Times New Roman"/>
+          <w:b/>
+          <w:color w:val="auto"/>
+          <w:sz w:val="26"/>
+          <w:szCs w:val="26"/>
+        </w:rPr>
+      </w:pPr>
+      <w:r>
+        <w:rPr>
+          <w:rFonts w:ascii="Times New Roman" w:hAnsi="Times New Roman" w:cs="Times New Roman"/>
+          <w:b/>
+          <w:color w:val="auto"/>
+          <w:sz w:val="26"/>
+          <w:szCs w:val="26"/>
+        </w:rPr>
+        <w:t>3</w:t>
+      </w:r>
+      <w:r>
+        <w:rPr>
+          <w:rFonts w:ascii="Times New Roman" w:hAnsi="Times New Roman" w:cs="Times New Roman"/>
+          <w:b/>
+          <w:color w:val="auto"/>
+          <w:sz w:val="26"/>
+          <w:szCs w:val="26"/>
+        </w:rPr>
+        <w:t>.</w:t>
+      </w:r>
+    </w:p>
+    <w:p>
+      <w:pPr>
+        <w:ind w:firstLine="0"/>
+      </w:pPr>
+    </w:p>
+    <w:p>
+      <w:pPr>
+        <w:pStyle w:val="Heading2"/>
+        <w:ind w:firstLine="0"/>
+        <w:rPr>
+          <w:rFonts w:ascii="Times New Roman" w:hAnsi="Times New Roman" w:cs="Times New Roman"/>
+          <w:b/>
+          <w:color w:val="auto"/>
+          <w:sz w:val="26"/>
+          <w:szCs w:val="26"/>
+        </w:rPr>
+      </w:pPr>
+      <w:r>
+        <w:rPr>
+          <w:rFonts w:ascii="Times New Roman" w:hAnsi="Times New Roman" w:cs="Times New Roman"/>
+          <w:b/>
+          <w:color w:val="auto"/>
+          <w:sz w:val="26"/>
+          <w:szCs w:val="26"/>
+        </w:rPr>
+        <w:t>4</w:t>
+      </w:r>
+      <w:r>
+        <w:rPr>
+          <w:rFonts w:ascii="Times New Roman" w:hAnsi="Times New Roman" w:cs="Times New Roman"/>
+          <w:b/>
+          <w:color w:val="auto"/>
+          <w:sz w:val="26"/>
+          <w:szCs w:val="26"/>
+        </w:rPr>
+        <w:t>.</w:t>
+      </w:r>
+    </w:p>
+    <w:p>
+      <w:pPr>
+        <w:ind w:firstLine="0"/>
+      </w:pPr>
+    </w:p>
+    <w:p>
+      <w:pPr>
+        <w:pStyle w:val="Heading2"/>
+        <w:ind w:firstLine="0"/>
+        <w:rPr>
+          <w:rFonts w:ascii="Times New Roman" w:hAnsi="Times New Roman" w:cs="Times New Roman"/>
+          <w:b/>
+          <w:color w:val="auto"/>
+          <w:sz w:val="26"/>
+          <w:szCs w:val="26"/>
+        </w:rPr>
+      </w:pPr>
+      <w:r>
+        <w:rPr>
+          <w:rFonts w:ascii="Times New Roman" w:hAnsi="Times New Roman" w:cs="Times New Roman"/>
+          <w:b/>
+          <w:color w:val="auto"/>
+          <w:sz w:val="26"/>
+          <w:szCs w:val="26"/>
+        </w:rPr>
+        <w:t>5.</w:t>
+      </w:r>
+    </w:p>
+    <w:p>
+      <w:pPr>
+        <w:ind w:firstLine="0"/>
+      </w:pPr>
+    </w:p>
+    <w:p>
+      <w:pPr>
+        <w:pStyle w:val="Heading2"/>
+        <w:ind w:firstLine="0"/>
+        <w:rPr>
+          <w:rFonts w:ascii="Times New Roman" w:hAnsi="Times New Roman" w:cs="Times New Roman"/>
+          <w:b/>
+          <w:color w:val="auto"/>
+          <w:sz w:val="26"/>
+          <w:szCs w:val="26"/>
+        </w:rPr>
+      </w:pPr>
+      <w:r>
+        <w:rPr>
+          <w:rFonts w:ascii="Times New Roman" w:hAnsi="Times New Roman" w:cs="Times New Roman"/>
+          <w:b/>
+          <w:color w:val="auto"/>
+          <w:sz w:val="26"/>
+          <w:szCs w:val="26"/>
+        </w:rPr>
+        <w:t>6.</w:t>
+      </w:r>
+    </w:p>
+    <w:p>
+      <w:pPr>
+        <w:ind w:firstLine="0"/>
+      </w:pPr>
+    </w:p>
+    <w:p>
+      <w:pPr>
+        <w:pStyle w:val="Heading2"/>
+        <w:ind w:firstLine="0"/>
+        <w:rPr>
+          <w:rFonts w:ascii="Times New Roman" w:hAnsi="Times New Roman" w:cs="Times New Roman"/>
+          <w:b/>
+          <w:color w:val="auto"/>
+          <w:sz w:val="26"/>
+          <w:szCs w:val="26"/>
+        </w:rPr>
+      </w:pPr>
+      <w:r>
+        <w:rPr>
+          <w:rFonts w:ascii="Times New Roman" w:hAnsi="Times New Roman" w:cs="Times New Roman"/>
+          <w:b/>
+          <w:color w:val="auto"/>
+          <w:sz w:val="26"/>
+          <w:szCs w:val="26"/>
+        </w:rPr>
+        <w:t>7.</w:t>
+      </w:r>
+    </w:p>
+    <w:p>
+      <w:pPr>
+        <w:ind w:firstLine="0"/>
+      </w:pPr>
+    </w:p>
+    <w:p>
+      <w:pPr>
+        <w:pStyle w:val="Heading2"/>
+        <w:ind w:firstLine="0"/>
+        <w:rPr>
+          <w:rFonts w:ascii="Times New Roman" w:hAnsi="Times New Roman" w:cs="Times New Roman"/>
+          <w:b/>
+          <w:color w:val="auto"/>
+          <w:sz w:val="26"/>
+          <w:szCs w:val="26"/>
+        </w:rPr>
+      </w:pPr>
+      <w:r>
+        <w:rPr>
+          <w:rFonts w:ascii="Times New Roman" w:hAnsi="Times New Roman" w:cs="Times New Roman"/>
+          <w:b/>
+          <w:color w:val="auto"/>
+          <w:sz w:val="26"/>
+          <w:szCs w:val="26"/>
+        </w:rPr>
+        <w:t>8.</w:t>
+      </w:r>
+    </w:p>
+    <w:p>
+      <w:pPr>
+        <w:ind w:firstLine="0"/>
+      </w:pPr>
+    </w:p>
+    <w:p>
+      <w:pPr>
+        <w:pStyle w:val="Heading2"/>
+        <w:ind w:firstLine="0"/>
+        <w:rPr>
+          <w:rFonts w:ascii="Times New Roman" w:hAnsi="Times New Roman" w:cs="Times New Roman"/>
+          <w:b/>
+          <w:color w:val="auto"/>
+          <w:sz w:val="26"/>
+          <w:szCs w:val="26"/>
+        </w:rPr>
+      </w:pPr>
+      <w:r>
+        <w:rPr>
+          <w:rFonts w:ascii="Times New Roman" w:hAnsi="Times New Roman" w:cs="Times New Roman"/>
+          <w:b/>
+          <w:color w:val="auto"/>
+          <w:sz w:val="26"/>
+          <w:szCs w:val="26"/>
+        </w:rPr>
+        <w:t>9.</w:t>
+      </w:r>
+    </w:p>
+    <w:p>
+      <w:pPr>
+        <w:ind w:firstLine="0"/>
+      </w:pPr>
+    </w:p>
+    <w:p>
+      <w:pPr>
+        <w:pStyle w:val="Heading2"/>
+        <w:ind w:firstLine="0"/>
+        <w:rPr>
+          <w:rFonts w:ascii="Times New Roman" w:hAnsi="Times New Roman" w:cs="Times New Roman"/>
+          <w:b/>
+          <w:color w:val="auto"/>
+          <w:sz w:val="26"/>
+          <w:szCs w:val="26"/>
+        </w:rPr>
+      </w:pPr>
+      <w:r>
+        <w:rPr>
+          <w:rFonts w:ascii="Times New Roman" w:hAnsi="Times New Roman" w:cs="Times New Roman"/>
+          <w:b/>
+          <w:color w:val="auto"/>
+          <w:sz w:val="26"/>
+          <w:szCs w:val="26"/>
+        </w:rPr>
+        <w:t>10.</w:t>
+      </w:r>
+    </w:p>
+    <w:p>
+      <w:pPr>
+        <w:ind w:firstLine="0"/>
+      </w:pPr>
+    </w:p>
+    <w:p>
+      <w:pPr>
+        <w:pStyle w:val="Heading2"/>
+        <w:ind w:firstLine="0"/>
+        <w:rPr>
+          <w:rFonts w:ascii="Times New Roman" w:hAnsi="Times New Roman" w:cs="Times New Roman"/>
+          <w:b/>
+          <w:color w:val="auto"/>
+          <w:sz w:val="26"/>
+          <w:szCs w:val="26"/>
+        </w:rPr>
+      </w:pPr>
+      <w:r>
+        <w:rPr>
+          <w:rFonts w:ascii="Times New Roman" w:hAnsi="Times New Roman" w:cs="Times New Roman"/>
+          <w:b/>
+          <w:color w:val="auto"/>
+          <w:sz w:val="26"/>
+          <w:szCs w:val="26"/>
+        </w:rPr>
+        <w:lastRenderedPageBreak/>
+        <w:t>11.</w:t>
+      </w:r>
+    </w:p>
+    <w:p>
+      <w:pPr>
+        <w:ind w:firstLine="0"/>
+      </w:pPr>
+    </w:p>
+    <w:p>
+      <w:pPr>
+        <w:pStyle w:val="Heading2"/>
+        <w:ind w:firstLine="0"/>
+        <w:rPr>
+          <w:rFonts w:ascii="Times New Roman" w:hAnsi="Times New Roman" w:cs="Times New Roman"/>
+          <w:b/>
+          <w:color w:val="auto"/>
+          <w:sz w:val="26"/>
+          <w:szCs w:val="26"/>
+        </w:rPr>
+      </w:pPr>
+      <w:r>
+        <w:rPr>
+          <w:rFonts w:ascii="Times New Roman" w:hAnsi="Times New Roman" w:cs="Times New Roman"/>
+          <w:b/>
+          <w:color w:val="auto"/>
+          <w:sz w:val="26"/>
+          <w:szCs w:val="26"/>
+        </w:rPr>
+        <w:t>12.</w:t>
+      </w:r>
+    </w:p>
+    <w:p>
+      <w:pPr>
+        <w:ind w:firstLine="0"/>
+      </w:pPr>
+    </w:p>
+    <w:p>
+      <w:pPr>
+        <w:pStyle w:val="Heading2"/>
+        <w:ind w:firstLine="0"/>
+        <w:rPr>
+          <w:rFonts w:ascii="Times New Roman" w:hAnsi="Times New Roman" w:cs="Times New Roman"/>
+          <w:b/>
+          <w:color w:val="auto"/>
+          <w:sz w:val="26"/>
+          <w:szCs w:val="26"/>
+        </w:rPr>
+      </w:pPr>
+      <w:r>
+        <w:rPr>
+          <w:rFonts w:ascii="Times New Roman" w:hAnsi="Times New Roman" w:cs="Times New Roman"/>
+          <w:b/>
+          <w:color w:val="auto"/>
+          <w:sz w:val="26"/>
+          <w:szCs w:val="26"/>
+        </w:rPr>
+        <w:t>13.</w:t>
+      </w:r>
+    </w:p>
+    <w:p>
+      <w:pPr>
+        <w:ind w:firstLine="0"/>
+      </w:pPr>
+    </w:p>
+    <w:p>
+      <w:pPr>
+        <w:pStyle w:val="Heading2"/>
+        <w:ind w:firstLine="0"/>
+        <w:rPr>
+          <w:rFonts w:ascii="Times New Roman" w:hAnsi="Times New Roman" w:cs="Times New Roman"/>
+          <w:b/>
+          <w:color w:val="auto"/>
+          <w:sz w:val="26"/>
+          <w:szCs w:val="26"/>
+        </w:rPr>
+      </w:pPr>
+      <w:r>
+        <w:rPr>
+          <w:rFonts w:ascii="Times New Roman" w:hAnsi="Times New Roman" w:cs="Times New Roman"/>
+          <w:b/>
+          <w:color w:val="auto"/>
+          <w:sz w:val="26"/>
+          <w:szCs w:val="26"/>
+        </w:rPr>
+        <w:t>14.</w:t>
+      </w:r>
+    </w:p>
+    <w:p>
+      <w:pPr>
+        <w:ind w:firstLine="0"/>
+      </w:pPr>
+    </w:p>
+    <w:p>
+      <w:pPr>
+        <w:pStyle w:val="Heading2"/>
+        <w:ind w:firstLine="0"/>
+        <w:rPr>
+          <w:rFonts w:ascii="Times New Roman" w:hAnsi="Times New Roman" w:cs="Times New Roman"/>
+          <w:b/>
+          <w:color w:val="auto"/>
+          <w:sz w:val="26"/>
+          <w:szCs w:val="26"/>
+        </w:rPr>
+      </w:pPr>
+      <w:r>
+        <w:rPr>
+          <w:rFonts w:ascii="Times New Roman" w:hAnsi="Times New Roman" w:cs="Times New Roman"/>
+          <w:b/>
+          <w:color w:val="auto"/>
+          <w:sz w:val="26"/>
+          <w:szCs w:val="26"/>
+        </w:rPr>
+        <w:t>15.</w:t>
+      </w:r>
+    </w:p>
+    <w:p>
+      <w:pPr>
+        <w:ind w:firstLine="0"/>
+      </w:pPr>
+    </w:p>
+    <w:p>
+      <w:pPr>
+        <w:ind w:firstLine="0"/>
+      </w:pPr>
     </w:p>
     <w:sectPr>
       <w:pgSz w:w="11906" w:h="16838" w:code="9"/>
@@ -1699,7 +3236,7 @@
 </file>
 
 <file path=customXml/itemProps1.xml><?xml version="1.0" encoding="utf-8"?>
-<ds:datastoreItem xmlns:ds="http://schemas.openxmlformats.org/officeDocument/2006/customXml" ds:itemID="{EF03E428-938E-40F8-A7F9-2FC5FA4075D8}">
+<ds:datastoreItem xmlns:ds="http://schemas.openxmlformats.org/officeDocument/2006/customXml" ds:itemID="{29616DD3-ED90-4D60-B802-D3566DE30397}">
   <ds:schemaRefs>
     <ds:schemaRef ds:uri="http://schemas.openxmlformats.org/officeDocument/2006/bibliography"/>
   </ds:schemaRefs>

</xml_diff>